<commit_message>
Deployed 0d87953 with MkDocs version: 1.6.1
</commit_message>
<xml_diff>
--- a/LEGACY_DOCS/Intrants_Extrants_v5.docx
+++ b/LEGACY_DOCS/Intrants_Extrants_v5.docx
@@ -19796,12 +19796,19 @@
       </w:pPr>
       <w:bookmarkStart w:id="674" w:name="_Toc165465446"/>
       <w:proofErr w:type="spellStart"/>
-      <w:r>
-        <w:t>e</w:t>
-      </w:r>
-      <w:r>
-        <w:t>tats</w:t>
-      </w:r>
+      <w:ins w:id="675" w:author="Suraj Patel" w:date="2025-09-22T20:06:00Z" w16du:dateUtc="2025-09-23T00:06:00Z">
+        <w:r>
+          <w:t>etatsPrecedents</w:t>
+        </w:r>
+      </w:ins>
+      <w:del w:id="676" w:author="Suraj Patel" w:date="2025-09-22T20:06:00Z" w16du:dateUtc="2025-09-23T00:06:00Z">
+        <w:r>
+          <w:delText>e</w:delText>
+        </w:r>
+        <w:r>
+          <w:delText>tats</w:delText>
+        </w:r>
+      </w:del>
       <w:r>
         <w:t>.quantite</w:t>
       </w:r>
@@ -20152,18 +20159,25 @@
       <w:pPr>
         <w:pStyle w:val="Heading2"/>
       </w:pPr>
-      <w:bookmarkStart w:id="675" w:name="_Toc165465447"/>
-      <w:proofErr w:type="spellStart"/>
-      <w:r>
-        <w:t>e</w:t>
-      </w:r>
-      <w:r>
-        <w:t>tats</w:t>
-      </w:r>
+      <w:bookmarkStart w:id="677" w:name="_Toc165465447"/>
+      <w:proofErr w:type="spellStart"/>
+      <w:ins w:id="678" w:author="Suraj Patel" w:date="2025-09-22T20:06:00Z" w16du:dateUtc="2025-09-23T00:06:00Z">
+        <w:r>
+          <w:t>etatsPrecedents</w:t>
+        </w:r>
+      </w:ins>
+      <w:del w:id="679" w:author="Suraj Patel" w:date="2025-09-22T20:06:00Z" w16du:dateUtc="2025-09-23T00:06:00Z">
+        <w:r>
+          <w:delText>e</w:delText>
+        </w:r>
+        <w:r>
+          <w:delText>tats</w:delText>
+        </w:r>
+      </w:del>
       <w:r>
         <w:t>.qualite</w:t>
       </w:r>
-      <w:bookmarkEnd w:id="675"/>
+      <w:bookmarkEnd w:id="677"/>
       <w:proofErr w:type="spellEnd"/>
     </w:p>
     <w:p>
@@ -20234,11 +20248,11 @@
       <w:pPr>
         <w:pStyle w:val="Heading2"/>
       </w:pPr>
-      <w:bookmarkStart w:id="676" w:name="_Assimilations"/>
-      <w:bookmarkStart w:id="677" w:name="_Assimilations.quantite"/>
-      <w:bookmarkStart w:id="678" w:name="_Toc165465448"/>
-      <w:bookmarkEnd w:id="676"/>
-      <w:bookmarkEnd w:id="677"/>
+      <w:bookmarkStart w:id="680" w:name="_Assimilations"/>
+      <w:bookmarkStart w:id="681" w:name="_Assimilations.quantite"/>
+      <w:bookmarkStart w:id="682" w:name="_Toc165465448"/>
+      <w:bookmarkEnd w:id="680"/>
+      <w:bookmarkEnd w:id="681"/>
       <w:proofErr w:type="spellStart"/>
       <w:r>
         <w:t>a</w:t>
@@ -20249,7 +20263,7 @@
       <w:r>
         <w:t>.quantite</w:t>
       </w:r>
-      <w:bookmarkEnd w:id="678"/>
+      <w:bookmarkEnd w:id="682"/>
       <w:proofErr w:type="spellEnd"/>
     </w:p>
     <w:p>
@@ -20834,12 +20848,12 @@
       <w:pPr>
         <w:pStyle w:val="Heading3"/>
       </w:pPr>
-      <w:bookmarkStart w:id="679" w:name="_Toc165465449"/>
+      <w:bookmarkStart w:id="683" w:name="_Toc165465449"/>
       <w:proofErr w:type="spellStart"/>
       <w:r>
         <w:t>etatsCE</w:t>
       </w:r>
-      <w:bookmarkEnd w:id="679"/>
+      <w:bookmarkEnd w:id="683"/>
       <w:proofErr w:type="spellEnd"/>
       <w:r>
         <w:t> </w:t>
@@ -20848,6 +20862,7 @@
     <w:p>
       <w:pPr>
         <w:rPr>
+          <w:ins w:id="684" w:author="Suraj Patel" w:date="2025-09-22T20:03:00Z" w16du:dateUtc="2025-09-23T00:03:00Z"/>
           <w:rFonts w:ascii="Courier New" w:hAnsi="Courier New" w:cs="Courier New"/>
         </w:rPr>
       </w:pPr>
@@ -21171,6 +21186,77 @@
         </w:rPr>
         <w:t xml:space="preserve"> double]</w:t>
       </w:r>
+    </w:p>
+    <w:p>
+      <w:pPr>
+        <w:rPr>
+          <w:rFonts w:ascii="Courier New" w:hAnsi="Courier New" w:cs="Courier New"/>
+        </w:rPr>
+      </w:pPr>
+      <w:ins w:id="685" w:author="Suraj Patel" w:date="2025-09-22T20:03:00Z" w16du:dateUtc="2025-09-23T00:03:00Z">
+        <w:r>
+          <w:rPr>
+            <w:rFonts w:ascii="Courier New" w:hAnsi="Courier New" w:cs="Courier New"/>
+          </w:rPr>
+          <w:t xml:space="preserve">        </w:t>
+        </w:r>
+        <w:r>
+          <w:rPr>
+            <w:rFonts w:ascii="Courier New" w:hAnsi="Courier New" w:cs="Courier New"/>
+          </w:rPr>
+          <w:t>ruissellement</w:t>
+        </w:r>
+        <w:r>
+          <w:rPr>
+            <w:rFonts w:ascii="Courier New" w:hAnsi="Courier New" w:cs="Courier New"/>
+          </w:rPr>
+          <w:t>:</w:t>
+        </w:r>
+        <w:r>
+          <w:rPr>
+            <w:rFonts w:ascii="Courier New" w:hAnsi="Courier New" w:cs="Courier New"/>
+          </w:rPr>
+          <w:t xml:space="preserve"> </w:t>
+        </w:r>
+        <w:r>
+          <w:rPr>
+            <w:rFonts w:ascii="Courier New" w:hAnsi="Courier New" w:cs="Courier New"/>
+          </w:rPr>
+          <w:t>[1</w:t>
+        </w:r>
+        <w:r>
+          <w:rPr>
+            <w:rFonts w:ascii="Courier New" w:hAnsi="Courier New" w:cs="Courier New"/>
+          </w:rPr>
+          <w:t xml:space="preserve"> </w:t>
+        </w:r>
+        <w:r>
+          <w:rPr>
+            <w:rFonts w:ascii="Courier New" w:hAnsi="Courier New" w:cs="Courier New"/>
+          </w:rPr>
+          <w:t>x</w:t>
+        </w:r>
+        <w:r>
+          <w:rPr>
+            <w:rFonts w:ascii="Courier New" w:hAnsi="Courier New" w:cs="Courier New"/>
+          </w:rPr>
+          <w:t xml:space="preserve"> </w:t>
+        </w:r>
+        <w:proofErr w:type="spellStart"/>
+        <w:r>
+          <w:rPr>
+            <w:rFonts w:ascii="Courier New" w:hAnsi="Courier New" w:cs="Courier New"/>
+          </w:rPr>
+          <w:t>nbAssimilations</w:t>
+        </w:r>
+        <w:proofErr w:type="spellEnd"/>
+        <w:r>
+          <w:rPr>
+            <w:rFonts w:ascii="Courier New" w:hAnsi="Courier New" w:cs="Courier New"/>
+          </w:rPr>
+          <w:t xml:space="preserve"> double]</w:t>
+        </w:r>
+      </w:ins>
       <w:r>
         <w:rPr>
           <w:rFonts w:ascii="Courier New" w:hAnsi="Courier New" w:cs="Courier New"/>
@@ -21297,6 +21383,7 @@
       <w:pPr>
         <w:ind w:left="360"/>
         <w:rPr>
+          <w:ins w:id="686" w:author="Suraj Patel" w:date="2025-09-22T20:03:00Z" w16du:dateUtc="2025-09-23T00:03:00Z"/>
           <w:rFonts w:ascii="Courier New" w:hAnsi="Courier New" w:cs="Courier New"/>
         </w:rPr>
       </w:pPr>
@@ -21457,6 +21544,34 @@
         </w:rPr>
         <w:t>: []</w:t>
       </w:r>
+    </w:p>
+    <w:p>
+      <w:pPr>
+        <w:ind w:left="360"/>
+        <w:rPr>
+          <w:rFonts w:ascii="Courier New" w:hAnsi="Courier New" w:cs="Courier New"/>
+        </w:rPr>
+      </w:pPr>
+      <w:ins w:id="687" w:author="Suraj Patel" w:date="2025-09-22T20:03:00Z" w16du:dateUtc="2025-09-23T00:03:00Z">
+        <w:r>
+          <w:rPr>
+            <w:rFonts w:ascii="Courier New" w:hAnsi="Courier New" w:cs="Courier New"/>
+          </w:rPr>
+          <w:t xml:space="preserve">        </w:t>
+        </w:r>
+        <w:r>
+          <w:rPr>
+            <w:rFonts w:ascii="Courier New" w:hAnsi="Courier New" w:cs="Courier New"/>
+          </w:rPr>
+          <w:t>ruissellement</w:t>
+        </w:r>
+        <w:r>
+          <w:rPr>
+            <w:rFonts w:ascii="Courier New" w:hAnsi="Courier New" w:cs="Courier New"/>
+          </w:rPr>
+          <w:t>: []</w:t>
+        </w:r>
+      </w:ins>
       <w:r>
         <w:rPr>
           <w:rFonts w:ascii="Courier New" w:hAnsi="Courier New" w:cs="Courier New"/>
@@ -21483,18 +21598,19 @@
         <w:pStyle w:val="Heading4"/>
       </w:pPr>
       <w:r>
+        <w:lastRenderedPageBreak/>
         <w:t>Format alternatif</w:t>
       </w:r>
     </w:p>
     <w:p>
       <w:r>
-        <w:lastRenderedPageBreak/>
         <w:t xml:space="preserve">Sauf pour le champ « id », il est possible de donner un facteur multiplicatif et additif plutôt qu’une valeur. </w:t>
       </w:r>
     </w:p>
     <w:p>
       <w:pPr>
         <w:rPr>
+          <w:ins w:id="688" w:author="Suraj Patel" w:date="2025-09-22T20:04:00Z" w16du:dateUtc="2025-09-23T00:04:00Z"/>
           <w:rFonts w:ascii="Courier New" w:hAnsi="Courier New" w:cs="Courier New"/>
         </w:rPr>
       </w:pPr>
@@ -21846,6 +21962,84 @@
         </w:rPr>
         <w:t xml:space="preserve"> double]</w:t>
       </w:r>
+    </w:p>
+    <w:p>
+      <w:pPr>
+        <w:rPr>
+          <w:rFonts w:ascii="Courier New" w:hAnsi="Courier New" w:cs="Courier New"/>
+        </w:rPr>
+      </w:pPr>
+      <w:ins w:id="689" w:author="Suraj Patel" w:date="2025-09-22T20:04:00Z" w16du:dateUtc="2025-09-23T00:04:00Z">
+        <w:r>
+          <w:rPr>
+            <w:rFonts w:ascii="Courier New" w:hAnsi="Courier New" w:cs="Courier New"/>
+          </w:rPr>
+          <w:t xml:space="preserve">        </w:t>
+        </w:r>
+        <w:r>
+          <w:rPr>
+            <w:rFonts w:ascii="Courier New" w:hAnsi="Courier New" w:cs="Courier New"/>
+          </w:rPr>
+          <w:t>ruissellement</w:t>
+        </w:r>
+        <w:r>
+          <w:rPr>
+            <w:rFonts w:ascii="Courier New" w:hAnsi="Courier New" w:cs="Courier New"/>
+          </w:rPr>
+          <w:t>:</w:t>
+        </w:r>
+        <w:r>
+          <w:rPr>
+            <w:rFonts w:ascii="Courier New" w:hAnsi="Courier New" w:cs="Courier New"/>
+          </w:rPr>
+          <w:t xml:space="preserve"> </w:t>
+        </w:r>
+        <w:r>
+          <w:rPr>
+            <w:rFonts w:ascii="Courier New" w:hAnsi="Courier New" w:cs="Courier New"/>
+          </w:rPr>
+          <w:t>[</w:t>
+        </w:r>
+        <w:r>
+          <w:rPr>
+            <w:rFonts w:ascii="Courier New" w:hAnsi="Courier New" w:cs="Courier New"/>
+            <w:b/>
+          </w:rPr>
+          <w:t>2</w:t>
+        </w:r>
+        <w:r>
+          <w:rPr>
+            <w:rFonts w:ascii="Courier New" w:hAnsi="Courier New" w:cs="Courier New"/>
+          </w:rPr>
+          <w:t xml:space="preserve"> </w:t>
+        </w:r>
+        <w:r>
+          <w:rPr>
+            <w:rFonts w:ascii="Courier New" w:hAnsi="Courier New" w:cs="Courier New"/>
+          </w:rPr>
+          <w:t>x</w:t>
+        </w:r>
+        <w:r>
+          <w:rPr>
+            <w:rFonts w:ascii="Courier New" w:hAnsi="Courier New" w:cs="Courier New"/>
+          </w:rPr>
+          <w:t xml:space="preserve"> </w:t>
+        </w:r>
+        <w:proofErr w:type="spellStart"/>
+        <w:r>
+          <w:rPr>
+            <w:rFonts w:ascii="Courier New" w:hAnsi="Courier New" w:cs="Courier New"/>
+          </w:rPr>
+          <w:t>nbAssimilations</w:t>
+        </w:r>
+        <w:proofErr w:type="spellEnd"/>
+        <w:r>
+          <w:rPr>
+            <w:rFonts w:ascii="Courier New" w:hAnsi="Courier New" w:cs="Courier New"/>
+          </w:rPr>
+          <w:t xml:space="preserve"> double]</w:t>
+        </w:r>
+      </w:ins>
       <w:r>
         <w:rPr>
           <w:rFonts w:ascii="Courier New" w:hAnsi="Courier New" w:cs="Courier New"/>
@@ -22214,6 +22408,7 @@
       <w:pPr>
         <w:ind w:left="360"/>
         <w:rPr>
+          <w:ins w:id="690" w:author="Suraj Patel" w:date="2025-09-22T20:04:00Z" w16du:dateUtc="2025-09-23T00:04:00Z"/>
           <w:rFonts w:ascii="Courier New" w:hAnsi="Courier New" w:cs="Courier New"/>
         </w:rPr>
       </w:pPr>
@@ -22296,6 +22491,34 @@
         </w:rPr>
         <w:t>: []</w:t>
       </w:r>
+    </w:p>
+    <w:p>
+      <w:pPr>
+        <w:ind w:left="360"/>
+        <w:rPr>
+          <w:rFonts w:ascii="Courier New" w:hAnsi="Courier New" w:cs="Courier New"/>
+        </w:rPr>
+      </w:pPr>
+      <w:ins w:id="691" w:author="Suraj Patel" w:date="2025-09-22T20:04:00Z" w16du:dateUtc="2025-09-23T00:04:00Z">
+        <w:r>
+          <w:rPr>
+            <w:rFonts w:ascii="Courier New" w:hAnsi="Courier New" w:cs="Courier New"/>
+          </w:rPr>
+          <w:t xml:space="preserve">      </w:t>
+        </w:r>
+        <w:r>
+          <w:rPr>
+            <w:rFonts w:ascii="Courier New" w:hAnsi="Courier New" w:cs="Courier New"/>
+          </w:rPr>
+          <w:t>ruissellement</w:t>
+        </w:r>
+        <w:r>
+          <w:rPr>
+            <w:rFonts w:ascii="Courier New" w:hAnsi="Courier New" w:cs="Courier New"/>
+          </w:rPr>
+          <w:t>: []</w:t>
+        </w:r>
+      </w:ins>
       <w:r>
         <w:rPr>
           <w:rFonts w:ascii="Courier New" w:hAnsi="Courier New" w:cs="Courier New"/>
@@ -22363,7 +22586,7 @@
           <w:lang w:val="en-CA"/>
         </w:rPr>
       </w:pPr>
-      <w:bookmarkStart w:id="680" w:name="_Toc165465450"/>
+      <w:bookmarkStart w:id="692" w:name="_Toc165465450"/>
       <w:proofErr w:type="spellStart"/>
       <w:r>
         <w:t>e</w:t>
@@ -22389,7 +22612,7 @@
         </w:rPr>
         <w:t>CP</w:t>
       </w:r>
-      <w:bookmarkEnd w:id="680"/>
+      <w:bookmarkEnd w:id="692"/>
       <w:proofErr w:type="spellEnd"/>
     </w:p>
     <w:p>
@@ -22784,12 +23007,12 @@
         <w:pStyle w:val="Heading4"/>
       </w:pPr>
       <w:r>
+        <w:lastRenderedPageBreak/>
         <w:t>Format alternatif</w:t>
       </w:r>
     </w:p>
     <w:p>
       <w:r>
-        <w:lastRenderedPageBreak/>
         <w:t>Sauf pour le champ « id », il est possible de donner un facteur multiplicatif et additif plutôt qu’une valeur.</w:t>
       </w:r>
     </w:p>
@@ -23284,9 +23507,9 @@
       <w:pPr>
         <w:pStyle w:val="Heading3"/>
       </w:pPr>
-      <w:bookmarkStart w:id="681" w:name="_etatsFonte"/>
-      <w:bookmarkStart w:id="682" w:name="_Toc165465451"/>
-      <w:bookmarkEnd w:id="681"/>
+      <w:bookmarkStart w:id="693" w:name="_etatsFonte"/>
+      <w:bookmarkStart w:id="694" w:name="_Toc165465451"/>
+      <w:bookmarkEnd w:id="693"/>
       <w:proofErr w:type="spellStart"/>
       <w:r>
         <w:t>etats</w:t>
@@ -23294,7 +23517,7 @@
       <w:r>
         <w:t>Fonte</w:t>
       </w:r>
-      <w:bookmarkEnd w:id="682"/>
+      <w:bookmarkEnd w:id="694"/>
       <w:proofErr w:type="spellEnd"/>
       <w:r>
         <w:t> </w:t>
@@ -23842,12 +24065,12 @@
         <w:pStyle w:val="Heading4"/>
       </w:pPr>
       <w:r>
+        <w:lastRenderedPageBreak/>
         <w:t>Format alternatif</w:t>
       </w:r>
     </w:p>
     <w:p>
       <w:r>
-        <w:lastRenderedPageBreak/>
         <w:t xml:space="preserve">Sauf pour le champ « id », il est possible de donner un facteur multiplicatif et additif plutôt qu’une valeur. </w:t>
       </w:r>
     </w:p>
@@ -24514,9 +24737,9 @@
       <w:pPr>
         <w:pStyle w:val="Heading3"/>
       </w:pPr>
-      <w:bookmarkStart w:id="683" w:name="_etatsEvapo"/>
-      <w:bookmarkStart w:id="684" w:name="_Toc165465452"/>
-      <w:bookmarkEnd w:id="683"/>
+      <w:bookmarkStart w:id="695" w:name="_etatsEvapo"/>
+      <w:bookmarkStart w:id="696" w:name="_Toc165465452"/>
+      <w:bookmarkEnd w:id="695"/>
       <w:proofErr w:type="spellStart"/>
       <w:r>
         <w:t>etats</w:t>
@@ -24524,7 +24747,7 @@
       <w:r>
         <w:t>Evapo</w:t>
       </w:r>
-      <w:bookmarkEnd w:id="684"/>
+      <w:bookmarkEnd w:id="696"/>
       <w:proofErr w:type="spellEnd"/>
       <w:r>
         <w:t> </w:t>
@@ -24573,7 +24796,7 @@
       <w:pPr>
         <w:pStyle w:val="Heading3"/>
       </w:pPr>
-      <w:bookmarkStart w:id="685" w:name="_Toc165465453"/>
+      <w:bookmarkStart w:id="697" w:name="_Toc165465453"/>
       <w:proofErr w:type="spellStart"/>
       <w:r>
         <w:t>e</w:t>
@@ -24587,7 +24810,7 @@
       <w:r>
         <w:t>Barrage</w:t>
       </w:r>
-      <w:bookmarkEnd w:id="685"/>
+      <w:bookmarkEnd w:id="697"/>
       <w:proofErr w:type="spellEnd"/>
     </w:p>
     <w:p>
@@ -24947,12 +25170,12 @@
         <w:pStyle w:val="Heading4"/>
       </w:pPr>
       <w:r>
+        <w:lastRenderedPageBreak/>
         <w:t>Format alternatif</w:t>
       </w:r>
     </w:p>
     <w:p>
       <w:r>
-        <w:lastRenderedPageBreak/>
         <w:t>Sauf pour le champ « </w:t>
       </w:r>
       <w:proofErr w:type="spellStart"/>
@@ -25377,9 +25600,9 @@
       <w:pPr>
         <w:pStyle w:val="Heading2"/>
       </w:pPr>
-      <w:bookmarkStart w:id="686" w:name="_Assimilations.qualite"/>
-      <w:bookmarkStart w:id="687" w:name="_Toc165465454"/>
-      <w:bookmarkEnd w:id="686"/>
+      <w:bookmarkStart w:id="698" w:name="_Assimilations.qualite"/>
+      <w:bookmarkStart w:id="699" w:name="_Toc165465454"/>
+      <w:bookmarkEnd w:id="698"/>
       <w:proofErr w:type="spellStart"/>
       <w:r>
         <w:t>a</w:t>
@@ -25387,7 +25610,7 @@
       <w:r>
         <w:t>ssimilations.qualite</w:t>
       </w:r>
-      <w:bookmarkEnd w:id="687"/>
+      <w:bookmarkEnd w:id="699"/>
       <w:proofErr w:type="spellEnd"/>
     </w:p>
     <w:p>
@@ -25496,7 +25719,7 @@
           <w:lang w:val="en-CA"/>
         </w:rPr>
       </w:pPr>
-      <w:bookmarkStart w:id="688" w:name="_Toc165465455"/>
+      <w:bookmarkStart w:id="700" w:name="_Toc165465455"/>
       <w:proofErr w:type="spellStart"/>
       <w:r>
         <w:t>e</w:t>
@@ -25510,7 +25733,7 @@
         </w:rPr>
         <w:t>tsCP</w:t>
       </w:r>
-      <w:bookmarkEnd w:id="688"/>
+      <w:bookmarkEnd w:id="700"/>
       <w:proofErr w:type="spellEnd"/>
     </w:p>
     <w:p>
@@ -25830,6 +26053,7 @@
     </w:p>
     <w:p>
       <w:r>
+        <w:lastRenderedPageBreak/>
         <w:t>Sauf pour le champ « id », il est possible de donner un facteur multiplicatif et additif plutôt qu’une valeur.</w:t>
       </w:r>
     </w:p>
@@ -25839,7 +26063,6 @@
         <w:rPr>
           <w:rFonts w:ascii="Courier New" w:hAnsi="Courier New" w:cs="Courier New"/>
         </w:rPr>
-        <w:lastRenderedPageBreak/>
         <w:t xml:space="preserve"> </w:t>
       </w:r>
       <w:r>
@@ -26182,20 +26405,20 @@
     <w:p>
       <w:pPr>
         <w:rPr>
-          <w:ins w:id="689" w:author="Suraj Patel" w:date="2024-05-01T14:06:00Z"/>
-        </w:rPr>
-      </w:pPr>
-    </w:p>
-    <w:p>
-      <w:pPr>
-        <w:rPr>
-          <w:del w:id="690" w:author="Suraj Patel" w:date="2025-04-22T20:31:00Z" w16du:dateUtc="2025-04-23T00:31:00Z"/>
-          <w:moveTo w:id="691" w:author="Suraj Patel" w:date="2024-05-01T14:06:00Z"/>
-        </w:rPr>
-      </w:pPr>
-      <w:moveToRangeStart w:id="692" w:author="Suraj Patel" w:date="2024-05-01T14:06:00Z" w:name="move165464801"/>
-      <w:moveTo w:id="693" w:author="Suraj Patel" w:date="2024-05-01T14:06:00Z">
-        <w:del w:id="694" w:author="Suraj Patel" w:date="2025-04-22T20:31:00Z" w16du:dateUtc="2025-04-23T00:31:00Z">
+          <w:ins w:id="701" w:author="Suraj Patel" w:date="2024-05-01T14:06:00Z"/>
+        </w:rPr>
+      </w:pPr>
+    </w:p>
+    <w:p>
+      <w:pPr>
+        <w:rPr>
+          <w:del w:id="702" w:author="Suraj Patel" w:date="2025-04-22T20:31:00Z" w16du:dateUtc="2025-04-23T00:31:00Z"/>
+          <w:moveTo w:id="703" w:author="Suraj Patel" w:date="2024-05-01T14:06:00Z"/>
+        </w:rPr>
+      </w:pPr>
+      <w:moveToRangeStart w:id="704" w:author="Suraj Patel" w:date="2024-05-01T14:06:00Z" w:name="move165464801"/>
+      <w:moveTo w:id="705" w:author="Suraj Patel" w:date="2024-05-01T14:06:00Z">
+        <w:del w:id="706" w:author="Suraj Patel" w:date="2025-04-22T20:31:00Z" w16du:dateUtc="2025-04-23T00:31:00Z">
           <w:r>
             <w:delText xml:space="preserve">Données pour l’eau pompé de la haute nappe. </w:delText>
           </w:r>
@@ -26208,21 +26431,21 @@
     <w:p>
       <w:pPr>
         <w:rPr>
-          <w:del w:id="695" w:author="Suraj Patel" w:date="2025-04-22T20:31:00Z" w16du:dateUtc="2025-04-23T00:31:00Z"/>
-          <w:moveTo w:id="696" w:author="Suraj Patel" w:date="2024-05-01T14:06:00Z"/>
-        </w:rPr>
-      </w:pPr>
-    </w:p>
-    <w:p>
-      <w:pPr>
-        <w:rPr>
-          <w:del w:id="697" w:author="Suraj Patel" w:date="2025-04-22T20:31:00Z" w16du:dateUtc="2025-04-23T00:31:00Z"/>
-          <w:moveTo w:id="698" w:author="Suraj Patel" w:date="2024-05-01T14:06:00Z"/>
-          <w:rFonts w:ascii="Courier New" w:hAnsi="Courier New" w:cs="Courier New"/>
-        </w:rPr>
-      </w:pPr>
-      <w:moveTo w:id="699" w:author="Suraj Patel" w:date="2024-05-01T14:06:00Z">
-        <w:del w:id="700" w:author="Suraj Patel" w:date="2025-04-22T20:31:00Z" w16du:dateUtc="2025-04-23T00:31:00Z">
+          <w:del w:id="707" w:author="Suraj Patel" w:date="2025-04-22T20:31:00Z" w16du:dateUtc="2025-04-23T00:31:00Z"/>
+          <w:moveTo w:id="708" w:author="Suraj Patel" w:date="2024-05-01T14:06:00Z"/>
+        </w:rPr>
+      </w:pPr>
+    </w:p>
+    <w:p>
+      <w:pPr>
+        <w:rPr>
+          <w:del w:id="709" w:author="Suraj Patel" w:date="2025-04-22T20:31:00Z" w16du:dateUtc="2025-04-23T00:31:00Z"/>
+          <w:moveTo w:id="710" w:author="Suraj Patel" w:date="2024-05-01T14:06:00Z"/>
+          <w:rFonts w:ascii="Courier New" w:hAnsi="Courier New" w:cs="Courier New"/>
+        </w:rPr>
+      </w:pPr>
+      <w:moveTo w:id="711" w:author="Suraj Patel" w:date="2024-05-01T14:06:00Z">
+        <w:del w:id="712" w:author="Suraj Patel" w:date="2025-04-22T20:31:00Z" w16du:dateUtc="2025-04-23T00:31:00Z">
           <w:r>
             <w:rPr>
               <w:rFonts w:ascii="Courier New" w:hAnsi="Courier New" w:cs="Courier New"/>
@@ -26230,7 +26453,7 @@
             <w:delText>pompage</w:delText>
           </w:r>
         </w:del>
-        <w:del w:id="701" w:author="Suraj Patel" w:date="2024-05-01T14:08:00Z">
+        <w:del w:id="713" w:author="Suraj Patel" w:date="2024-05-01T14:08:00Z">
           <w:r>
             <w:rPr>
               <w:rFonts w:ascii="Courier New" w:hAnsi="Courier New" w:cs="Courier New"/>
@@ -26238,7 +26461,7 @@
             <w:delText>H</w:delText>
           </w:r>
         </w:del>
-        <w:del w:id="702" w:author="Suraj Patel" w:date="2024-05-01T14:07:00Z">
+        <w:del w:id="714" w:author="Suraj Patel" w:date="2024-05-01T14:07:00Z">
           <w:r>
             <w:rPr>
               <w:rFonts w:ascii="Courier New" w:hAnsi="Courier New" w:cs="Courier New"/>
@@ -26246,7 +26469,7 @@
             <w:delText>N</w:delText>
           </w:r>
         </w:del>
-        <w:del w:id="703" w:author="Suraj Patel" w:date="2025-04-22T20:31:00Z" w16du:dateUtc="2025-04-23T00:31:00Z">
+        <w:del w:id="715" w:author="Suraj Patel" w:date="2025-04-22T20:31:00Z" w16du:dateUtc="2025-04-23T00:31:00Z">
           <w:r>
             <w:rPr>
               <w:rFonts w:ascii="Courier New" w:hAnsi="Courier New" w:cs="Courier New"/>
@@ -26256,11 +26479,11 @@
         </w:del>
       </w:moveTo>
     </w:p>
-    <w:moveToRangeEnd w:id="692"/>
-    <w:p>
-      <w:pPr>
-        <w:rPr>
-          <w:del w:id="704" w:author="Suraj Patel" w:date="2025-04-22T20:31:00Z" w16du:dateUtc="2025-04-23T00:31:00Z"/>
+    <w:moveToRangeEnd w:id="704"/>
+    <w:p>
+      <w:pPr>
+        <w:rPr>
+          <w:del w:id="716" w:author="Suraj Patel" w:date="2025-04-22T20:31:00Z" w16du:dateUtc="2025-04-23T00:31:00Z"/>
         </w:rPr>
       </w:pPr>
     </w:p>
@@ -26268,7 +26491,7 @@
       <w:pPr>
         <w:pStyle w:val="Heading2"/>
       </w:pPr>
-      <w:bookmarkStart w:id="705" w:name="_Toc165465457"/>
+      <w:bookmarkStart w:id="717" w:name="_Toc165465457"/>
       <w:r>
         <w:t>Ex</w:t>
       </w:r>
@@ -26278,7 +26501,7 @@
       <w:r>
         <w:t>rants</w:t>
       </w:r>
-      <w:bookmarkEnd w:id="705"/>
+      <w:bookmarkEnd w:id="717"/>
     </w:p>
     <w:p>
       <w:r>
@@ -26315,7 +26538,7 @@
       <w:pPr>
         <w:pStyle w:val="Heading2"/>
       </w:pPr>
-      <w:bookmarkStart w:id="706" w:name="_Toc165465458"/>
+      <w:bookmarkStart w:id="718" w:name="_Toc165465458"/>
       <w:proofErr w:type="spellStart"/>
       <w:r>
         <w:t>etatsCE</w:t>
@@ -26340,11 +26563,12 @@
       <w:r>
         <w:t>]</w:t>
       </w:r>
-      <w:bookmarkEnd w:id="706"/>
-    </w:p>
-    <w:p>
-      <w:pPr>
-        <w:rPr>
+      <w:bookmarkEnd w:id="718"/>
+    </w:p>
+    <w:p>
+      <w:pPr>
+        <w:rPr>
+          <w:ins w:id="719" w:author="Suraj Patel" w:date="2025-09-22T20:04:00Z" w16du:dateUtc="2025-09-23T00:04:00Z"/>
           <w:rFonts w:ascii="Courier New" w:hAnsi="Courier New" w:cs="Courier New"/>
         </w:rPr>
       </w:pPr>
@@ -26705,6 +26929,53 @@
         </w:rPr>
         <w:t xml:space="preserve"> double]</w:t>
       </w:r>
+    </w:p>
+    <w:p>
+      <w:pPr>
+        <w:rPr>
+          <w:rFonts w:ascii="Courier New" w:hAnsi="Courier New" w:cs="Courier New"/>
+        </w:rPr>
+      </w:pPr>
+      <w:ins w:id="720" w:author="Suraj Patel" w:date="2025-09-22T20:04:00Z" w16du:dateUtc="2025-09-23T00:04:00Z">
+        <w:r>
+          <w:rPr>
+            <w:rFonts w:ascii="Courier New" w:hAnsi="Courier New" w:cs="Courier New"/>
+          </w:rPr>
+          <w:t xml:space="preserve">        </w:t>
+        </w:r>
+        <w:r>
+          <w:rPr>
+            <w:rFonts w:ascii="Courier New" w:hAnsi="Courier New" w:cs="Courier New"/>
+          </w:rPr>
+          <w:t>ruissellement</w:t>
+        </w:r>
+        <w:r>
+          <w:rPr>
+            <w:rFonts w:ascii="Courier New" w:hAnsi="Courier New" w:cs="Courier New"/>
+          </w:rPr>
+          <w:t>: [</w:t>
+        </w:r>
+        <w:r>
+          <w:rPr>
+            <w:rFonts w:ascii="Courier New" w:hAnsi="Courier New" w:cs="Courier New"/>
+          </w:rPr>
+          <w:t xml:space="preserve">1 x </w:t>
+        </w:r>
+        <w:proofErr w:type="spellStart"/>
+        <w:r>
+          <w:rPr>
+            <w:rFonts w:ascii="Courier New" w:hAnsi="Courier New" w:cs="Courier New"/>
+          </w:rPr>
+          <w:t>nbCE</w:t>
+        </w:r>
+        <w:proofErr w:type="spellEnd"/>
+        <w:r>
+          <w:rPr>
+            <w:rFonts w:ascii="Courier New" w:hAnsi="Courier New" w:cs="Courier New"/>
+          </w:rPr>
+          <w:t xml:space="preserve"> double]</w:t>
+        </w:r>
+      </w:ins>
       <w:r>
         <w:rPr>
           <w:rFonts w:ascii="Courier New" w:hAnsi="Courier New" w:cs="Courier New"/>
@@ -26749,7 +27020,7 @@
       <w:pPr>
         <w:pStyle w:val="Heading2"/>
       </w:pPr>
-      <w:bookmarkStart w:id="707" w:name="_Toc165465459"/>
+      <w:bookmarkStart w:id="721" w:name="_Toc165465459"/>
       <w:proofErr w:type="spellStart"/>
       <w:r>
         <w:t>etatsCP</w:t>
@@ -26774,7 +27045,7 @@
       <w:r>
         <w:t>]</w:t>
       </w:r>
-      <w:bookmarkEnd w:id="707"/>
+      <w:bookmarkEnd w:id="721"/>
     </w:p>
     <w:p>
       <w:pPr>
@@ -27009,7 +27280,7 @@
       <w:pPr>
         <w:pStyle w:val="Heading2"/>
       </w:pPr>
-      <w:bookmarkStart w:id="708" w:name="_Toc165465460"/>
+      <w:bookmarkStart w:id="722" w:name="_Toc165465460"/>
       <w:proofErr w:type="spellStart"/>
       <w:r>
         <w:t>etatsFonte</w:t>
@@ -27034,7 +27305,7 @@
       <w:r>
         <w:t>]</w:t>
       </w:r>
-      <w:bookmarkEnd w:id="708"/>
+      <w:bookmarkEnd w:id="722"/>
     </w:p>
     <w:p>
       <w:pPr>
@@ -27153,6 +27424,7 @@
         <w:rPr>
           <w:rFonts w:ascii="Courier New" w:hAnsi="Courier New" w:cs="Courier New"/>
         </w:rPr>
+        <w:lastRenderedPageBreak/>
         <w:t>indexMurissementNeige</w:t>
       </w:r>
       <w:proofErr w:type="spellEnd"/>
@@ -27239,10 +27511,9 @@
       <w:pPr>
         <w:pStyle w:val="Heading2"/>
       </w:pPr>
-      <w:bookmarkStart w:id="709" w:name="_Toc165465461"/>
-      <w:proofErr w:type="spellStart"/>
-      <w:r>
-        <w:lastRenderedPageBreak/>
+      <w:bookmarkStart w:id="723" w:name="_Toc165465461"/>
+      <w:proofErr w:type="spellStart"/>
+      <w:r>
         <w:t>etatsEvapo</w:t>
       </w:r>
       <w:proofErr w:type="spellEnd"/>
@@ -27265,7 +27536,7 @@
       <w:r>
         <w:t>]</w:t>
       </w:r>
-      <w:bookmarkEnd w:id="709"/>
+      <w:bookmarkEnd w:id="723"/>
     </w:p>
     <w:p>
       <w:pPr>
@@ -27311,7 +27582,7 @@
       <w:pPr>
         <w:pStyle w:val="Heading2"/>
       </w:pPr>
-      <w:bookmarkStart w:id="710" w:name="_Toc165465462"/>
+      <w:bookmarkStart w:id="724" w:name="_Toc165465462"/>
       <w:proofErr w:type="spellStart"/>
       <w:r>
         <w:t>etatsBarrage</w:t>
@@ -27336,15 +27607,15 @@
       <w:r>
         <w:t>]</w:t>
       </w:r>
-      <w:bookmarkEnd w:id="710"/>
-    </w:p>
-    <w:p>
-      <w:pPr>
-        <w:rPr>
-          <w:rFonts w:ascii="Courier New" w:hAnsi="Courier New" w:cs="Courier New"/>
-        </w:rPr>
-      </w:pPr>
-      <w:ins w:id="711" w:author="Suraj Patel" w:date="2025-01-20T15:33:00Z">
+      <w:bookmarkEnd w:id="724"/>
+    </w:p>
+    <w:p>
+      <w:pPr>
+        <w:rPr>
+          <w:rFonts w:ascii="Courier New" w:hAnsi="Courier New" w:cs="Courier New"/>
+        </w:rPr>
+      </w:pPr>
+      <w:ins w:id="725" w:author="Suraj Patel" w:date="2025-01-20T15:33:00Z">
         <w:r>
           <w:rPr>
             <w:rFonts w:ascii="Courier New" w:hAnsi="Courier New" w:cs="Courier New"/>
@@ -27352,7 +27623,7 @@
           <w:t xml:space="preserve"> </w:t>
         </w:r>
       </w:ins>
-      <w:ins w:id="712" w:author="Suraj Patel" w:date="2025-01-20T15:34:00Z">
+      <w:ins w:id="726" w:author="Suraj Patel" w:date="2025-01-20T15:34:00Z">
         <w:r>
           <w:rPr>
             <w:rFonts w:ascii="Courier New" w:hAnsi="Courier New" w:cs="Courier New"/>
@@ -27360,7 +27631,7 @@
           <w:t xml:space="preserve">      </w:t>
         </w:r>
       </w:ins>
-      <w:ins w:id="713" w:author="Suraj Patel" w:date="2025-01-20T15:33:00Z">
+      <w:ins w:id="727" w:author="Suraj Patel" w:date="2025-01-20T15:33:00Z">
         <w:r>
           <w:rPr>
             <w:rFonts w:ascii="Courier New" w:hAnsi="Courier New" w:cs="Courier New"/>
@@ -27389,7 +27660,7 @@
         <w:br/>
         <w:t xml:space="preserve">        </w:t>
       </w:r>
-      <w:ins w:id="714" w:author="Suraj Patel" w:date="2025-01-20T15:34:00Z">
+      <w:ins w:id="728" w:author="Suraj Patel" w:date="2025-01-20T15:34:00Z">
         <w:r>
           <w:rPr>
             <w:rFonts w:ascii="Courier New" w:hAnsi="Courier New" w:cs="Courier New"/>
@@ -27409,7 +27680,7 @@
         </w:rPr>
         <w:t xml:space="preserve"> </w:t>
       </w:r>
-      <w:ins w:id="715" w:author="Suraj Patel" w:date="2025-01-20T15:33:00Z">
+      <w:ins w:id="729" w:author="Suraj Patel" w:date="2025-01-20T15:33:00Z">
         <w:r>
           <w:rPr>
             <w:rFonts w:ascii="Courier New" w:hAnsi="Courier New" w:cs="Courier New"/>
@@ -27436,7 +27707,7 @@
         <w:br/>
         <w:t xml:space="preserve">          </w:t>
       </w:r>
-      <w:ins w:id="716" w:author="Suraj Patel" w:date="2025-01-20T15:34:00Z">
+      <w:ins w:id="730" w:author="Suraj Patel" w:date="2025-01-20T15:34:00Z">
         <w:r>
           <w:rPr>
             <w:rFonts w:ascii="Courier New" w:hAnsi="Courier New" w:cs="Courier New"/>
@@ -27469,7 +27740,7 @@
         </w:rPr>
         <w:t xml:space="preserve">          </w:t>
       </w:r>
-      <w:ins w:id="717" w:author="Suraj Patel" w:date="2025-01-20T15:33:00Z">
+      <w:ins w:id="731" w:author="Suraj Patel" w:date="2025-01-20T15:33:00Z">
         <w:r>
           <w:rPr>
             <w:rFonts w:ascii="Courier New" w:hAnsi="Courier New" w:cs="Courier New"/>
@@ -27537,12 +27808,12 @@
       <w:pPr>
         <w:pStyle w:val="Heading2"/>
       </w:pPr>
-      <w:bookmarkStart w:id="718" w:name="_Toc165465463"/>
+      <w:bookmarkStart w:id="732" w:name="_Toc165465463"/>
       <w:proofErr w:type="spellStart"/>
       <w:r>
         <w:t>pasDeTemps</w:t>
       </w:r>
-      <w:bookmarkEnd w:id="718"/>
+      <w:bookmarkEnd w:id="732"/>
       <w:proofErr w:type="spellEnd"/>
     </w:p>
     <w:p>
@@ -27563,7 +27834,7 @@
       <w:pPr>
         <w:pStyle w:val="Heading2"/>
       </w:pPr>
-      <w:bookmarkStart w:id="719" w:name="_Toc165465464"/>
+      <w:bookmarkStart w:id="733" w:name="_Toc165465464"/>
       <w:proofErr w:type="spellStart"/>
       <w:r>
         <w:t>etatsQualiteCP</w:t>
@@ -27588,7 +27859,7 @@
       <w:r>
         <w:t>]</w:t>
       </w:r>
-      <w:bookmarkEnd w:id="719"/>
+      <w:bookmarkEnd w:id="733"/>
     </w:p>
     <w:p>
       <w:r>
@@ -28285,6 +28556,7 @@
       </w:pPr>
       <w:proofErr w:type="spellStart"/>
       <w:r>
+        <w:lastRenderedPageBreak/>
         <w:t>qconv</w:t>
       </w:r>
       <w:proofErr w:type="spellEnd"/>
@@ -28297,17 +28569,16 @@
       <w:pPr>
         <w:pStyle w:val="Heading2"/>
       </w:pPr>
-      <w:bookmarkStart w:id="720" w:name="_Toc165465465"/>
+      <w:bookmarkStart w:id="734" w:name="_Toc165465465"/>
       <w:proofErr w:type="spellStart"/>
       <w:r>
         <w:t>avantAssimilations</w:t>
       </w:r>
-      <w:bookmarkEnd w:id="720"/>
-      <w:proofErr w:type="spellEnd"/>
-    </w:p>
-    <w:p>
-      <w:r>
-        <w:lastRenderedPageBreak/>
+      <w:bookmarkEnd w:id="734"/>
+      <w:proofErr w:type="spellEnd"/>
+    </w:p>
+    <w:p>
+      <w:r>
         <w:t>Sauvegarde des états avant assimilation pour chaque pas de temps d’assimilation. La structure est la même que l’intrant « </w:t>
       </w:r>
       <w:proofErr w:type="spellStart"/>
@@ -28341,12 +28612,12 @@
       <w:pPr>
         <w:pStyle w:val="Heading2"/>
       </w:pPr>
-      <w:bookmarkStart w:id="721" w:name="_Toc165465466"/>
+      <w:bookmarkStart w:id="735" w:name="_Toc165465466"/>
       <w:proofErr w:type="spellStart"/>
       <w:r>
         <w:t>avantAssimilationsFonte</w:t>
       </w:r>
-      <w:bookmarkEnd w:id="721"/>
+      <w:bookmarkEnd w:id="735"/>
       <w:proofErr w:type="spellEnd"/>
     </w:p>
     <w:p>
@@ -28384,12 +28655,12 @@
       <w:pPr>
         <w:pStyle w:val="Heading2"/>
       </w:pPr>
-      <w:bookmarkStart w:id="722" w:name="_Toc165465467"/>
+      <w:bookmarkStart w:id="736" w:name="_Toc165465467"/>
       <w:proofErr w:type="spellStart"/>
       <w:r>
         <w:t>avantAssimilationsEvapo</w:t>
       </w:r>
-      <w:bookmarkEnd w:id="722"/>
+      <w:bookmarkEnd w:id="736"/>
       <w:proofErr w:type="spellEnd"/>
     </w:p>
     <w:p>
@@ -28427,12 +28698,12 @@
       <w:pPr>
         <w:pStyle w:val="Heading2"/>
       </w:pPr>
-      <w:bookmarkStart w:id="723" w:name="_Toc165465468"/>
+      <w:bookmarkStart w:id="737" w:name="_Toc165465468"/>
       <w:proofErr w:type="spellStart"/>
       <w:r>
         <w:t>avantAssimilationsQualite</w:t>
       </w:r>
-      <w:bookmarkEnd w:id="723"/>
+      <w:bookmarkEnd w:id="737"/>
       <w:proofErr w:type="spellEnd"/>
     </w:p>
     <w:p>
@@ -28459,32 +28730,32 @@
     <w:p>
       <w:pPr>
         <w:rPr>
-          <w:del w:id="724" w:author="Suraj Patel" w:date="2024-05-01T14:06:00Z"/>
-        </w:rPr>
-      </w:pPr>
-      <w:bookmarkStart w:id="725" w:name="_Toc165465409"/>
-      <w:bookmarkStart w:id="726" w:name="_Toc165465469"/>
-      <w:bookmarkEnd w:id="725"/>
-      <w:bookmarkEnd w:id="726"/>
-    </w:p>
-    <w:p>
-      <w:pPr>
-        <w:rPr>
-          <w:ins w:id="727" w:author="Suraj Patel" w:date="2025-03-03T10:21:00Z" w16du:dateUtc="2025-03-03T15:21:00Z"/>
-        </w:rPr>
-      </w:pPr>
-    </w:p>
-    <w:p>
-      <w:pPr>
-        <w:rPr>
-          <w:ins w:id="728" w:author="Suraj Patel" w:date="2025-03-03T10:21:00Z" w16du:dateUtc="2025-03-03T15:21:00Z"/>
-        </w:rPr>
-      </w:pPr>
-    </w:p>
-    <w:p>
-      <w:pPr>
-        <w:rPr>
-          <w:ins w:id="729" w:author="Suraj Patel" w:date="2025-03-03T10:21:00Z" w16du:dateUtc="2025-03-03T15:21:00Z"/>
+          <w:del w:id="738" w:author="Suraj Patel" w:date="2024-05-01T14:06:00Z"/>
+        </w:rPr>
+      </w:pPr>
+      <w:bookmarkStart w:id="739" w:name="_Toc165465409"/>
+      <w:bookmarkStart w:id="740" w:name="_Toc165465469"/>
+      <w:bookmarkEnd w:id="739"/>
+      <w:bookmarkEnd w:id="740"/>
+    </w:p>
+    <w:p>
+      <w:pPr>
+        <w:rPr>
+          <w:ins w:id="741" w:author="Suraj Patel" w:date="2025-03-03T10:21:00Z" w16du:dateUtc="2025-03-03T15:21:00Z"/>
+        </w:rPr>
+      </w:pPr>
+    </w:p>
+    <w:p>
+      <w:pPr>
+        <w:rPr>
+          <w:ins w:id="742" w:author="Suraj Patel" w:date="2025-03-03T10:21:00Z" w16du:dateUtc="2025-03-03T15:21:00Z"/>
+        </w:rPr>
+      </w:pPr>
+    </w:p>
+    <w:p>
+      <w:pPr>
+        <w:rPr>
+          <w:ins w:id="743" w:author="Suraj Patel" w:date="2025-03-03T10:21:00Z" w16du:dateUtc="2025-03-03T15:21:00Z"/>
         </w:rPr>
       </w:pPr>
     </w:p>
@@ -28492,10 +28763,10 @@
       <w:pPr>
         <w:pStyle w:val="Heading1"/>
         <w:rPr>
-          <w:del w:id="730" w:author="Suraj Patel" w:date="2024-05-01T14:06:00Z"/>
-        </w:rPr>
-      </w:pPr>
-      <w:del w:id="731" w:author="Suraj Patel" w:date="2024-05-01T14:06:00Z">
+          <w:del w:id="744" w:author="Suraj Patel" w:date="2024-05-01T14:06:00Z"/>
+        </w:rPr>
+      </w:pPr>
+      <w:del w:id="745" w:author="Suraj Patel" w:date="2024-05-01T14:06:00Z">
         <w:r>
           <w:delText>pompageEau</w:delText>
         </w:r>
@@ -28504,9 +28775,9 @@
     <w:p>
       <w:pPr>
         <w:rPr>
-          <w:ins w:id="732" w:author="Suraj Patel" w:date="2025-03-03T10:21:00Z" w16du:dateUtc="2025-03-03T15:21:00Z"/>
-        </w:rPr>
-        <w:pPrChange w:id="733" w:author="Suraj Patel" w:date="2025-03-03T10:21:00Z" w16du:dateUtc="2025-03-03T15:21:00Z">
+          <w:ins w:id="746" w:author="Suraj Patel" w:date="2025-03-03T10:21:00Z" w16du:dateUtc="2025-03-03T15:21:00Z"/>
+        </w:rPr>
+        <w:pPrChange w:id="747" w:author="Suraj Patel" w:date="2025-03-03T10:21:00Z" w16du:dateUtc="2025-03-03T15:21:00Z">
           <w:pPr>
             <w:pStyle w:val="Heading2"/>
           </w:pPr>
@@ -28517,7 +28788,7 @@
       <w:pPr>
         <w:ind w:firstLine="360"/>
         <w:rPr>
-          <w:ins w:id="734" w:author="Suraj Patel" w:date="2025-04-22T20:32:00Z" w16du:dateUtc="2025-04-23T00:32:00Z"/>
+          <w:ins w:id="748" w:author="Suraj Patel" w:date="2025-04-22T20:32:00Z" w16du:dateUtc="2025-04-23T00:32:00Z"/>
           <w:rFonts w:asciiTheme="majorHAnsi" w:eastAsiaTheme="majorEastAsia" w:hAnsiTheme="majorHAnsi" w:cstheme="majorBidi"/>
           <w:b/>
           <w:bCs/>
@@ -28526,7 +28797,7 @@
           <w:szCs w:val="24"/>
         </w:rPr>
       </w:pPr>
-      <w:ins w:id="735" w:author="Suraj Patel" w:date="2025-04-22T20:32:00Z" w16du:dateUtc="2025-04-23T00:32:00Z">
+      <w:ins w:id="749" w:author="Suraj Patel" w:date="2025-04-22T20:32:00Z" w16du:dateUtc="2025-04-23T00:32:00Z">
         <w:r>
           <w:br w:type="page"/>
         </w:r>
@@ -28535,11 +28806,11 @@
     <w:p>
       <w:pPr>
         <w:rPr>
-          <w:moveFrom w:id="736" w:author="Suraj Patel" w:date="2024-05-01T14:06:00Z"/>
-        </w:rPr>
-      </w:pPr>
-      <w:moveFromRangeStart w:id="737" w:author="Suraj Patel" w:date="2024-05-01T14:06:00Z" w:name="move165464801"/>
-      <w:moveFrom w:id="738" w:author="Suraj Patel" w:date="2024-05-01T14:06:00Z">
+          <w:moveFrom w:id="750" w:author="Suraj Patel" w:date="2024-05-01T14:06:00Z"/>
+        </w:rPr>
+      </w:pPr>
+      <w:moveFromRangeStart w:id="751" w:author="Suraj Patel" w:date="2024-05-01T14:06:00Z" w:name="move165464801"/>
+      <w:moveFrom w:id="752" w:author="Suraj Patel" w:date="2024-05-01T14:06:00Z">
         <w:r>
           <w:lastRenderedPageBreak/>
           <w:t xml:space="preserve">Données </w:t>
@@ -28562,54 +28833,54 @@
         <w:r>
           <w:t>Les données doivent être représentées comme la quantité moyenne d'eau pompée en litre par seconde pour chaque pas de temps. Les données doivent également suivre le même ordre que les carrés entiers.</w:t>
         </w:r>
-        <w:bookmarkStart w:id="739" w:name="_Toc165465411"/>
-        <w:bookmarkStart w:id="740" w:name="_Toc165465471"/>
-        <w:bookmarkEnd w:id="739"/>
-        <w:bookmarkEnd w:id="740"/>
+        <w:bookmarkStart w:id="753" w:name="_Toc165465411"/>
+        <w:bookmarkStart w:id="754" w:name="_Toc165465471"/>
+        <w:bookmarkEnd w:id="753"/>
+        <w:bookmarkEnd w:id="754"/>
       </w:moveFrom>
     </w:p>
     <w:p>
       <w:pPr>
         <w:rPr>
-          <w:moveFrom w:id="741" w:author="Suraj Patel" w:date="2024-05-01T14:06:00Z"/>
-        </w:rPr>
-      </w:pPr>
-      <w:bookmarkStart w:id="742" w:name="_Toc165465412"/>
-      <w:bookmarkStart w:id="743" w:name="_Toc165465472"/>
-      <w:bookmarkEnd w:id="742"/>
-      <w:bookmarkEnd w:id="743"/>
-    </w:p>
-    <w:p>
-      <w:pPr>
-        <w:rPr>
-          <w:moveFrom w:id="744" w:author="Suraj Patel" w:date="2024-05-01T14:06:00Z"/>
-          <w:rFonts w:ascii="Courier New" w:hAnsi="Courier New" w:cs="Courier New"/>
-        </w:rPr>
-      </w:pPr>
-      <w:moveFrom w:id="745" w:author="Suraj Patel" w:date="2024-05-01T14:06:00Z">
+          <w:moveFrom w:id="755" w:author="Suraj Patel" w:date="2024-05-01T14:06:00Z"/>
+        </w:rPr>
+      </w:pPr>
+      <w:bookmarkStart w:id="756" w:name="_Toc165465412"/>
+      <w:bookmarkStart w:id="757" w:name="_Toc165465472"/>
+      <w:bookmarkEnd w:id="756"/>
+      <w:bookmarkEnd w:id="757"/>
+    </w:p>
+    <w:p>
+      <w:pPr>
+        <w:rPr>
+          <w:moveFrom w:id="758" w:author="Suraj Patel" w:date="2024-05-01T14:06:00Z"/>
+          <w:rFonts w:ascii="Courier New" w:hAnsi="Courier New" w:cs="Courier New"/>
+        </w:rPr>
+      </w:pPr>
+      <w:moveFrom w:id="759" w:author="Suraj Patel" w:date="2024-05-01T14:06:00Z">
         <w:r>
           <w:rPr>
             <w:rFonts w:ascii="Courier New" w:hAnsi="Courier New" w:cs="Courier New"/>
           </w:rPr>
           <w:t>pompageHN: [nbPasDeTemps x nbCE double ou single]</w:t>
         </w:r>
-        <w:bookmarkStart w:id="746" w:name="_Toc165465413"/>
-        <w:bookmarkStart w:id="747" w:name="_Toc165465473"/>
-        <w:bookmarkEnd w:id="746"/>
-        <w:bookmarkEnd w:id="747"/>
+        <w:bookmarkStart w:id="760" w:name="_Toc165465413"/>
+        <w:bookmarkStart w:id="761" w:name="_Toc165465473"/>
+        <w:bookmarkEnd w:id="760"/>
+        <w:bookmarkEnd w:id="761"/>
       </w:moveFrom>
     </w:p>
     <w:p>
       <w:pPr>
         <w:pStyle w:val="Heading1"/>
       </w:pPr>
-      <w:bookmarkStart w:id="748" w:name="_Toc165465474"/>
-      <w:moveFromRangeEnd w:id="737"/>
+      <w:bookmarkStart w:id="762" w:name="_Toc165465474"/>
+      <w:moveFromRangeEnd w:id="751"/>
       <w:proofErr w:type="spellStart"/>
       <w:r>
         <w:t>CequeauInterpolationMex</w:t>
       </w:r>
-      <w:bookmarkEnd w:id="748"/>
+      <w:bookmarkEnd w:id="762"/>
       <w:proofErr w:type="spellEnd"/>
     </w:p>
     <w:p>
@@ -28674,11 +28945,11 @@
       <w:pPr>
         <w:pStyle w:val="Heading2"/>
       </w:pPr>
-      <w:bookmarkStart w:id="749" w:name="_Toc165465475"/>
+      <w:bookmarkStart w:id="763" w:name="_Toc165465475"/>
       <w:r>
         <w:t>Intrants</w:t>
       </w:r>
-      <w:bookmarkEnd w:id="749"/>
+      <w:bookmarkEnd w:id="763"/>
     </w:p>
     <w:p>
       <w:r>
@@ -28689,12 +28960,12 @@
       <w:pPr>
         <w:pStyle w:val="Heading2"/>
       </w:pPr>
-      <w:bookmarkStart w:id="750" w:name="_Toc165465476"/>
+      <w:bookmarkStart w:id="764" w:name="_Toc165465476"/>
       <w:proofErr w:type="spellStart"/>
       <w:r>
         <w:t>execution</w:t>
       </w:r>
-      <w:bookmarkEnd w:id="750"/>
+      <w:bookmarkEnd w:id="764"/>
       <w:proofErr w:type="spellEnd"/>
     </w:p>
     <w:p>
@@ -28799,12 +29070,12 @@
       <w:pPr>
         <w:pStyle w:val="Heading2"/>
       </w:pPr>
-      <w:bookmarkStart w:id="751" w:name="_Toc165465477"/>
+      <w:bookmarkStart w:id="765" w:name="_Toc165465477"/>
       <w:proofErr w:type="spellStart"/>
       <w:r>
         <w:t>parametres</w:t>
       </w:r>
-      <w:bookmarkEnd w:id="751"/>
+      <w:bookmarkEnd w:id="765"/>
       <w:proofErr w:type="spellEnd"/>
     </w:p>
     <w:p>
@@ -29169,7 +29440,7 @@
       <w:pPr>
         <w:pStyle w:val="Heading3"/>
       </w:pPr>
-      <w:bookmarkStart w:id="752" w:name="_Toc165465478"/>
+      <w:bookmarkStart w:id="766" w:name="_Toc165465478"/>
       <w:proofErr w:type="spellStart"/>
       <w:r>
         <w:t>p</w:t>
@@ -29180,7 +29451,7 @@
       <w:r>
         <w:t>.interpolation</w:t>
       </w:r>
-      <w:bookmarkEnd w:id="752"/>
+      <w:bookmarkEnd w:id="766"/>
       <w:proofErr w:type="spellEnd"/>
     </w:p>
     <w:p>
@@ -29362,12 +29633,12 @@
       <w:pPr>
         <w:pStyle w:val="Heading2"/>
       </w:pPr>
-      <w:bookmarkStart w:id="753" w:name="_Toc165465479"/>
+      <w:bookmarkStart w:id="767" w:name="_Toc165465479"/>
       <w:proofErr w:type="spellStart"/>
       <w:r>
         <w:t>bassinVersant</w:t>
       </w:r>
-      <w:bookmarkEnd w:id="753"/>
+      <w:bookmarkEnd w:id="767"/>
       <w:proofErr w:type="spellEnd"/>
     </w:p>
     <w:p>
@@ -29529,7 +29800,7 @@
       <w:pPr>
         <w:pStyle w:val="Heading2"/>
       </w:pPr>
-      <w:bookmarkStart w:id="754" w:name="_Toc165465480"/>
+      <w:bookmarkStart w:id="768" w:name="_Toc165465480"/>
       <w:r>
         <w:t>stations</w:t>
       </w:r>
@@ -29552,7 +29823,7 @@
       <w:r>
         <w:t>]</w:t>
       </w:r>
-      <w:bookmarkEnd w:id="754"/>
+      <w:bookmarkEnd w:id="768"/>
     </w:p>
     <w:p/>
     <w:p>
@@ -29771,12 +30042,12 @@
       <w:pPr>
         <w:pStyle w:val="Heading2"/>
       </w:pPr>
-      <w:bookmarkStart w:id="755" w:name="_Toc165465481"/>
+      <w:bookmarkStart w:id="769" w:name="_Toc165465481"/>
       <w:proofErr w:type="spellStart"/>
       <w:r>
         <w:t>meteoStations</w:t>
       </w:r>
-      <w:bookmarkEnd w:id="755"/>
+      <w:bookmarkEnd w:id="769"/>
       <w:proofErr w:type="spellEnd"/>
     </w:p>
     <w:p>
@@ -30022,7 +30293,7 @@
       <w:pPr>
         <w:pStyle w:val="Heading2"/>
       </w:pPr>
-      <w:bookmarkStart w:id="756" w:name="_Toc165465482"/>
+      <w:bookmarkStart w:id="770" w:name="_Toc165465482"/>
       <w:r>
         <w:t>Ex</w:t>
       </w:r>
@@ -30032,7 +30303,7 @@
       <w:r>
         <w:t>rants</w:t>
       </w:r>
-      <w:bookmarkEnd w:id="756"/>
+      <w:bookmarkEnd w:id="770"/>
     </w:p>
     <w:p>
       <w:r>
@@ -30141,7 +30412,7 @@
               <w:rFonts w:ascii="Cambria" w:hAnsi="Cambria"/>
               <w:sz w:val="18"/>
               <w:szCs w:val="18"/>
-              <w:rPrChange w:id="757" w:author="Suraj Patel" w:date="2025-04-20T17:58:00Z" w16du:dateUtc="2025-04-20T21:58:00Z">
+              <w:rPrChange w:id="771" w:author="Suraj Patel" w:date="2025-04-20T17:58:00Z" w16du:dateUtc="2025-04-20T21:58:00Z">
                 <w:rPr>
                   <w:rFonts w:ascii="Cambria" w:hAnsi="Cambria"/>
                 </w:rPr>
@@ -30155,7 +30426,7 @@
               <w:bCs/>
               <w:sz w:val="18"/>
               <w:szCs w:val="18"/>
-              <w:rPrChange w:id="758" w:author="Suraj Patel" w:date="2025-04-20T17:58:00Z" w16du:dateUtc="2025-04-20T21:58:00Z">
+              <w:rPrChange w:id="772" w:author="Suraj Patel" w:date="2025-04-20T17:58:00Z" w16du:dateUtc="2025-04-20T21:58:00Z">
                 <w:rPr>
                   <w:rFonts w:ascii="Cambria" w:hAnsi="Cambria"/>
                   <w:b/>
@@ -30170,7 +30441,7 @@
               <w:rFonts w:ascii="Calibri" w:hAnsi="Calibri"/>
               <w:sz w:val="18"/>
               <w:szCs w:val="18"/>
-              <w:rPrChange w:id="759" w:author="Suraj Patel" w:date="2025-04-20T17:58:00Z" w16du:dateUtc="2025-04-20T21:58:00Z">
+              <w:rPrChange w:id="773" w:author="Suraj Patel" w:date="2025-04-20T17:58:00Z" w16du:dateUtc="2025-04-20T21:58:00Z">
                 <w:rPr>
                   <w:rFonts w:ascii="Calibri" w:hAnsi="Calibri"/>
                 </w:rPr>
@@ -30182,7 +30453,7 @@
             <w:rPr>
               <w:sz w:val="18"/>
               <w:szCs w:val="18"/>
-              <w:rPrChange w:id="760" w:author="Suraj Patel" w:date="2025-04-20T17:58:00Z" w16du:dateUtc="2025-04-20T21:58:00Z">
+              <w:rPrChange w:id="774" w:author="Suraj Patel" w:date="2025-04-20T17:58:00Z" w16du:dateUtc="2025-04-20T21:58:00Z">
                 <w:rPr/>
               </w:rPrChange>
             </w:rPr>
@@ -30193,7 +30464,7 @@
               <w:rFonts w:ascii="Calibri" w:hAnsi="Calibri"/>
               <w:sz w:val="18"/>
               <w:szCs w:val="18"/>
-              <w:rPrChange w:id="761" w:author="Suraj Patel" w:date="2025-04-20T17:58:00Z" w16du:dateUtc="2025-04-20T21:58:00Z">
+              <w:rPrChange w:id="775" w:author="Suraj Patel" w:date="2025-04-20T17:58:00Z" w16du:dateUtc="2025-04-20T21:58:00Z">
                 <w:rPr>
                   <w:rFonts w:ascii="Cambria" w:hAnsi="Cambria"/>
                   <w:b/>
@@ -30212,7 +30483,7 @@
               <w:noProof/>
               <w:sz w:val="18"/>
               <w:szCs w:val="18"/>
-              <w:rPrChange w:id="762" w:author="Suraj Patel" w:date="2025-04-20T17:58:00Z" w16du:dateUtc="2025-04-20T21:58:00Z">
+              <w:rPrChange w:id="776" w:author="Suraj Patel" w:date="2025-04-20T17:58:00Z" w16du:dateUtc="2025-04-20T21:58:00Z">
                 <w:rPr>
                   <w:rFonts w:ascii="Cambria" w:hAnsi="Cambria"/>
                   <w:b/>
@@ -30231,7 +30502,7 @@
               <w:noProof/>
               <w:sz w:val="18"/>
               <w:szCs w:val="18"/>
-              <w:rPrChange w:id="763" w:author="Suraj Patel" w:date="2025-04-20T17:58:00Z" w16du:dateUtc="2025-04-20T21:58:00Z">
+              <w:rPrChange w:id="777" w:author="Suraj Patel" w:date="2025-04-20T17:58:00Z" w16du:dateUtc="2025-04-20T21:58:00Z">
                 <w:rPr>
                   <w:rFonts w:ascii="Cambria" w:hAnsi="Cambria"/>
                   <w:b/>

</xml_diff>